<commit_message>
Task 2 feature engineering
</commit_message>
<xml_diff>
--- a/capstone_part2/Part2DeliverablesExecutionOutput.docx
+++ b/capstone_part2/Part2DeliverablesExecutionOutput.docx
@@ -136,24 +136,56 @@
         <w:spacing w:after="173"/>
       </w:pPr>
       <w:r>
-        <w:t>The notebook reports 1730 changes in weather_description.</w:t>
+        <w:t xml:space="preserve">The notebook reports 1730 changes in </w:t>
+      </w:r>
+      <w:proofErr w:type="spellStart"/>
+      <w:r>
+        <w:t>weather_description</w:t>
+      </w:r>
+      <w:proofErr w:type="spellEnd"/>
+      <w:r>
+        <w:t>.</w:t>
       </w:r>
     </w:p>
     <w:p>
       <w:r>
-        <w:t>The date_time column was converted to datetime using the expected format. T</w:t>
+        <w:t xml:space="preserve">The </w:t>
+      </w:r>
+      <w:proofErr w:type="spellStart"/>
+      <w:r>
+        <w:t>date_time</w:t>
+      </w:r>
+      <w:proofErr w:type="spellEnd"/>
+      <w:r>
+        <w:t xml:space="preserve"> column was converted to datetime using the expected format. </w:t>
+      </w:r>
+      <w:proofErr w:type="spellStart"/>
+      <w:r>
+        <w:t>T</w:t>
       </w:r>
       <w:r>
         <w:t xml:space="preserve"> </w:t>
       </w:r>
       <w:r>
-        <w:t>he actual dataset had no missing o</w:t>
+        <w:t>he</w:t>
+      </w:r>
+      <w:proofErr w:type="spellEnd"/>
+      <w:r>
+        <w:t xml:space="preserve"> actual dataset had no missing </w:t>
+      </w:r>
+      <w:proofErr w:type="spellStart"/>
+      <w:r>
+        <w:t>o</w:t>
       </w:r>
       <w:r>
         <w:t xml:space="preserve"> </w:t>
       </w:r>
       <w:r>
-        <w:t>r invalid dates.</w:t>
+        <w:t>r</w:t>
+      </w:r>
+      <w:proofErr w:type="spellEnd"/>
+      <w:r>
+        <w:t xml:space="preserve"> invalid dates.</w:t>
       </w:r>
     </w:p>
     <w:p>
@@ -434,6 +466,503 @@
       </w:pPr>
       <w:r>
         <w:t>Debug mode shows the monthly medians and the pipeline completes successfully.</w:t>
+      </w:r>
+    </w:p>
+    <w:p/>
+    <w:p>
+      <w:r>
+        <w:br w:type="page"/>
+      </w:r>
+    </w:p>
+    <w:p>
+      <w:pPr>
+        <w:keepNext/>
+      </w:pPr>
+      <w:r>
+        <w:rPr>
+          <w:b/>
+        </w:rPr>
+        <w:lastRenderedPageBreak/>
+        <w:t xml:space="preserve">Task 2: Feature Engineering </w:t>
+      </w:r>
+    </w:p>
+    <w:p>
+      <w:pPr>
+        <w:keepNext/>
+      </w:pPr>
+      <w:r>
+        <w:rPr>
+          <w:b/>
+        </w:rPr>
+        <w:t>2.1 Time features</w:t>
+      </w:r>
+    </w:p>
+    <w:p>
+      <w:r>
+        <w:rPr>
+          <w:noProof/>
+        </w:rPr>
+        <w:drawing>
+          <wp:inline distT="0" distB="0" distL="0" distR="0" wp14:anchorId="7969E270" wp14:editId="6E20CAE9">
+            <wp:extent cx="5724144" cy="3490332"/>
+            <wp:effectExtent l="0" t="0" r="0" b="0"/>
+            <wp:docPr id="8" name="Picture 8"/>
+            <wp:cNvGraphicFramePr>
+              <a:graphicFrameLocks xmlns:a="http://schemas.openxmlformats.org/drawingml/2006/main" noChangeAspect="1"/>
+            </wp:cNvGraphicFramePr>
+            <a:graphic xmlns:a="http://schemas.openxmlformats.org/drawingml/2006/main">
+              <a:graphicData uri="http://schemas.openxmlformats.org/drawingml/2006/picture">
+                <pic:pic xmlns:pic="http://schemas.openxmlformats.org/drawingml/2006/picture">
+                  <pic:nvPicPr>
+                    <pic:cNvPr id="0" name="evidence_db772851-4d1b-4aaf-86e4-a6c257d25d34.png"/>
+                    <pic:cNvPicPr/>
+                  </pic:nvPicPr>
+                  <pic:blipFill>
+                    <a:blip r:embed="rId12"/>
+                    <a:stretch>
+                      <a:fillRect/>
+                    </a:stretch>
+                  </pic:blipFill>
+                  <pic:spPr>
+                    <a:xfrm>
+                      <a:off x="0" y="0"/>
+                      <a:ext cx="5724144" cy="3490332"/>
+                    </a:xfrm>
+                    <a:prstGeom prst="rect">
+                      <a:avLst/>
+                    </a:prstGeom>
+                  </pic:spPr>
+                </pic:pic>
+              </a:graphicData>
+            </a:graphic>
+          </wp:inline>
+        </w:drawing>
+      </w:r>
+    </w:p>
+    <w:p>
+      <w:r>
+        <w:t>Hour encoded with sine and cosine using a 24-hour cycle. This keeps nearby hours close across midnight, including 23:00 and 00:00.</w:t>
+      </w:r>
+    </w:p>
+    <w:p>
+      <w:r>
+        <w:br w:type="page"/>
+      </w:r>
+    </w:p>
+    <w:p>
+      <w:pPr>
+        <w:keepNext/>
+      </w:pPr>
+      <w:r>
+        <w:rPr>
+          <w:b/>
+        </w:rPr>
+        <w:lastRenderedPageBreak/>
+        <w:t>2.2 Cyclical encoding and weather features</w:t>
+      </w:r>
+    </w:p>
+    <w:p>
+      <w:r>
+        <w:rPr>
+          <w:noProof/>
+        </w:rPr>
+        <w:drawing>
+          <wp:inline distT="0" distB="0" distL="0" distR="0" wp14:anchorId="7B153FF5" wp14:editId="794388D2">
+            <wp:extent cx="5724144" cy="2241748"/>
+            <wp:effectExtent l="0" t="0" r="0" b="0"/>
+            <wp:docPr id="9" name="Picture 9"/>
+            <wp:cNvGraphicFramePr>
+              <a:graphicFrameLocks xmlns:a="http://schemas.openxmlformats.org/drawingml/2006/main" noChangeAspect="1"/>
+            </wp:cNvGraphicFramePr>
+            <a:graphic xmlns:a="http://schemas.openxmlformats.org/drawingml/2006/main">
+              <a:graphicData uri="http://schemas.openxmlformats.org/drawingml/2006/picture">
+                <pic:pic xmlns:pic="http://schemas.openxmlformats.org/drawingml/2006/picture">
+                  <pic:nvPicPr>
+                    <pic:cNvPr id="0" name="evidence_beaec825-c176-416f-89c6-1af8180ec775.png"/>
+                    <pic:cNvPicPr/>
+                  </pic:nvPicPr>
+                  <pic:blipFill>
+                    <a:blip r:embed="rId13"/>
+                    <a:stretch>
+                      <a:fillRect/>
+                    </a:stretch>
+                  </pic:blipFill>
+                  <pic:spPr>
+                    <a:xfrm>
+                      <a:off x="0" y="0"/>
+                      <a:ext cx="5724144" cy="2241748"/>
+                    </a:xfrm>
+                    <a:prstGeom prst="rect">
+                      <a:avLst/>
+                    </a:prstGeom>
+                  </pic:spPr>
+                </pic:pic>
+              </a:graphicData>
+            </a:graphic>
+          </wp:inline>
+        </w:drawing>
+      </w:r>
+    </w:p>
+    <w:p>
+      <w:r>
+        <w:rPr>
+          <w:noProof/>
+        </w:rPr>
+        <w:drawing>
+          <wp:inline distT="0" distB="0" distL="0" distR="0" wp14:anchorId="2EE4D301" wp14:editId="1B7FAACD">
+            <wp:extent cx="5724144" cy="2642763"/>
+            <wp:effectExtent l="0" t="0" r="0" b="0"/>
+            <wp:docPr id="10" name="Picture 10"/>
+            <wp:cNvGraphicFramePr>
+              <a:graphicFrameLocks xmlns:a="http://schemas.openxmlformats.org/drawingml/2006/main" noChangeAspect="1"/>
+            </wp:cNvGraphicFramePr>
+            <a:graphic xmlns:a="http://schemas.openxmlformats.org/drawingml/2006/main">
+              <a:graphicData uri="http://schemas.openxmlformats.org/drawingml/2006/picture">
+                <pic:pic xmlns:pic="http://schemas.openxmlformats.org/drawingml/2006/picture">
+                  <pic:nvPicPr>
+                    <pic:cNvPr id="0" name="evidence_6425ce48-7066-4e63-9de0-5c69b3087eb7.png"/>
+                    <pic:cNvPicPr/>
+                  </pic:nvPicPr>
+                  <pic:blipFill>
+                    <a:blip r:embed="rId14"/>
+                    <a:stretch>
+                      <a:fillRect/>
+                    </a:stretch>
+                  </pic:blipFill>
+                  <pic:spPr>
+                    <a:xfrm>
+                      <a:off x="0" y="0"/>
+                      <a:ext cx="5724144" cy="2642763"/>
+                    </a:xfrm>
+                    <a:prstGeom prst="rect">
+                      <a:avLst/>
+                    </a:prstGeom>
+                  </pic:spPr>
+                </pic:pic>
+              </a:graphicData>
+            </a:graphic>
+          </wp:inline>
+        </w:drawing>
+      </w:r>
+    </w:p>
+    <w:p>
+      <w:r>
+        <w:t>I tried to verify that each category is shown.</w:t>
+      </w:r>
+    </w:p>
+    <w:p>
+      <w:r>
+        <w:br w:type="page"/>
+      </w:r>
+    </w:p>
+    <w:p>
+      <w:pPr>
+        <w:keepNext/>
+      </w:pPr>
+      <w:r>
+        <w:rPr>
+          <w:b/>
+        </w:rPr>
+        <w:lastRenderedPageBreak/>
+        <w:t>2.3 Numerical features</w:t>
+      </w:r>
+    </w:p>
+    <w:p>
+      <w:r>
+        <w:rPr>
+          <w:noProof/>
+        </w:rPr>
+        <w:drawing>
+          <wp:inline distT="0" distB="0" distL="0" distR="0" wp14:anchorId="0BC8415C" wp14:editId="1C801375">
+            <wp:extent cx="5724144" cy="4067155"/>
+            <wp:effectExtent l="0" t="0" r="0" b="0"/>
+            <wp:docPr id="11" name="Picture 11"/>
+            <wp:cNvGraphicFramePr>
+              <a:graphicFrameLocks xmlns:a="http://schemas.openxmlformats.org/drawingml/2006/main" noChangeAspect="1"/>
+            </wp:cNvGraphicFramePr>
+            <a:graphic xmlns:a="http://schemas.openxmlformats.org/drawingml/2006/main">
+              <a:graphicData uri="http://schemas.openxmlformats.org/drawingml/2006/picture">
+                <pic:pic xmlns:pic="http://schemas.openxmlformats.org/drawingml/2006/picture">
+                  <pic:nvPicPr>
+                    <pic:cNvPr id="0" name="evidence_0f68e82e-7e5e-481f-bf9f-e62d94dc6c09.png"/>
+                    <pic:cNvPicPr/>
+                  </pic:nvPicPr>
+                  <pic:blipFill>
+                    <a:blip r:embed="rId15"/>
+                    <a:stretch>
+                      <a:fillRect/>
+                    </a:stretch>
+                  </pic:blipFill>
+                  <pic:spPr>
+                    <a:xfrm>
+                      <a:off x="0" y="0"/>
+                      <a:ext cx="5724144" cy="4067155"/>
+                    </a:xfrm>
+                    <a:prstGeom prst="rect">
+                      <a:avLst/>
+                    </a:prstGeom>
+                  </pic:spPr>
+                </pic:pic>
+              </a:graphicData>
+            </a:graphic>
+          </wp:inline>
+        </w:drawing>
+      </w:r>
+    </w:p>
+    <w:p>
+      <w:r>
+        <w:t xml:space="preserve">The temperature range was 243.39 to 310.07 Kelvin. The rainfall range was 0.0 to 55.63 mm. </w:t>
+      </w:r>
+    </w:p>
+    <w:p>
+      <w:r>
+        <w:br w:type="page"/>
+      </w:r>
+    </w:p>
+    <w:p>
+      <w:pPr>
+        <w:keepNext/>
+      </w:pPr>
+      <w:r>
+        <w:rPr>
+          <w:b/>
+        </w:rPr>
+        <w:lastRenderedPageBreak/>
+        <w:t>2.4 Traffic target</w:t>
+      </w:r>
+    </w:p>
+    <w:p>
+      <w:r>
+        <w:t>I chose the 25th and 75th percentiles so the thresholds come from the cleaned traffic data. This separates lower and higher traffic records while keeping the middle range as Medium. Unlike the fixed 5500 threshold used in Part 1, these thresholds depend on the dataset. Equal values at a boundary can make the group sizes differ slightly from 25 percent, 50 percent and 25 percent.</w:t>
+      </w:r>
+    </w:p>
+    <w:p>
+      <w:r>
+        <w:rPr>
+          <w:noProof/>
+        </w:rPr>
+        <w:drawing>
+          <wp:inline distT="0" distB="0" distL="0" distR="0" wp14:anchorId="78772958" wp14:editId="0E7A1DDE">
+            <wp:extent cx="5724144" cy="3922958"/>
+            <wp:effectExtent l="0" t="0" r="0" b="0"/>
+            <wp:docPr id="12" name="Picture 12"/>
+            <wp:cNvGraphicFramePr>
+              <a:graphicFrameLocks xmlns:a="http://schemas.openxmlformats.org/drawingml/2006/main" noChangeAspect="1"/>
+            </wp:cNvGraphicFramePr>
+            <a:graphic xmlns:a="http://schemas.openxmlformats.org/drawingml/2006/main">
+              <a:graphicData uri="http://schemas.openxmlformats.org/drawingml/2006/picture">
+                <pic:pic xmlns:pic="http://schemas.openxmlformats.org/drawingml/2006/picture">
+                  <pic:nvPicPr>
+                    <pic:cNvPr id="0" name="evidence_fee0a424-019d-4fee-a921-82f8ca634325.png"/>
+                    <pic:cNvPicPr/>
+                  </pic:nvPicPr>
+                  <pic:blipFill>
+                    <a:blip r:embed="rId16"/>
+                    <a:stretch>
+                      <a:fillRect/>
+                    </a:stretch>
+                  </pic:blipFill>
+                  <pic:spPr>
+                    <a:xfrm>
+                      <a:off x="0" y="0"/>
+                      <a:ext cx="5724144" cy="3922958"/>
+                    </a:xfrm>
+                    <a:prstGeom prst="rect">
+                      <a:avLst/>
+                    </a:prstGeom>
+                  </pic:spPr>
+                </pic:pic>
+              </a:graphicData>
+            </a:graphic>
+          </wp:inline>
+        </w:drawing>
+      </w:r>
+    </w:p>
+    <w:p>
+      <w:r>
+        <w:t xml:space="preserve">Low has 12047 records, Medium has 24103 records and High has 12037 records. </w:t>
+      </w:r>
+    </w:p>
+    <w:p>
+      <w:r>
+        <w:br w:type="page"/>
+      </w:r>
+    </w:p>
+    <w:p>
+      <w:pPr>
+        <w:keepNext/>
+      </w:pPr>
+      <w:r>
+        <w:rPr>
+          <w:b/>
+        </w:rPr>
+        <w:lastRenderedPageBreak/>
+        <w:t>2.5 Validate and save the features</w:t>
+      </w:r>
+    </w:p>
+    <w:p>
+      <w:r>
+        <w:rPr>
+          <w:noProof/>
+        </w:rPr>
+        <w:drawing>
+          <wp:inline distT="0" distB="0" distL="0" distR="0" wp14:anchorId="7DD87BBA" wp14:editId="750F839B">
+            <wp:extent cx="5724144" cy="4321670"/>
+            <wp:effectExtent l="0" t="0" r="0" b="0"/>
+            <wp:docPr id="13" name="Picture 13"/>
+            <wp:cNvGraphicFramePr>
+              <a:graphicFrameLocks xmlns:a="http://schemas.openxmlformats.org/drawingml/2006/main" noChangeAspect="1"/>
+            </wp:cNvGraphicFramePr>
+            <a:graphic xmlns:a="http://schemas.openxmlformats.org/drawingml/2006/main">
+              <a:graphicData uri="http://schemas.openxmlformats.org/drawingml/2006/picture">
+                <pic:pic xmlns:pic="http://schemas.openxmlformats.org/drawingml/2006/picture">
+                  <pic:nvPicPr>
+                    <pic:cNvPr id="0" name="evidence_fcd1f855-1bfc-43ce-ac3f-4c0400a86f7a.png"/>
+                    <pic:cNvPicPr/>
+                  </pic:nvPicPr>
+                  <pic:blipFill>
+                    <a:blip r:embed="rId17"/>
+                    <a:stretch>
+                      <a:fillRect/>
+                    </a:stretch>
+                  </pic:blipFill>
+                  <pic:spPr>
+                    <a:xfrm>
+                      <a:off x="0" y="0"/>
+                      <a:ext cx="5724144" cy="4321670"/>
+                    </a:xfrm>
+                    <a:prstGeom prst="rect">
+                      <a:avLst/>
+                    </a:prstGeom>
+                  </pic:spPr>
+                </pic:pic>
+              </a:graphicData>
+            </a:graphic>
+          </wp:inline>
+        </w:drawing>
+      </w:r>
+    </w:p>
+    <w:p>
+      <w:r>
+        <w:br w:type="page"/>
+      </w:r>
+    </w:p>
+    <w:p>
+      <w:pPr>
+        <w:keepNext/>
+      </w:pPr>
+      <w:r>
+        <w:rPr>
+          <w:b/>
+        </w:rPr>
+        <w:lastRenderedPageBreak/>
+        <w:t>2.6 Run the standalone script and check logging</w:t>
+      </w:r>
+    </w:p>
+    <w:p>
+      <w:r>
+        <w:rPr>
+          <w:noProof/>
+        </w:rPr>
+        <w:drawing>
+          <wp:inline distT="0" distB="0" distL="0" distR="0" wp14:anchorId="6F38C705" wp14:editId="7037F271">
+            <wp:extent cx="5724144" cy="1567403"/>
+            <wp:effectExtent l="0" t="0" r="0" b="0"/>
+            <wp:docPr id="14" name="Picture 14"/>
+            <wp:cNvGraphicFramePr>
+              <a:graphicFrameLocks xmlns:a="http://schemas.openxmlformats.org/drawingml/2006/main" noChangeAspect="1"/>
+            </wp:cNvGraphicFramePr>
+            <a:graphic xmlns:a="http://schemas.openxmlformats.org/drawingml/2006/main">
+              <a:graphicData uri="http://schemas.openxmlformats.org/drawingml/2006/picture">
+                <pic:pic xmlns:pic="http://schemas.openxmlformats.org/drawingml/2006/picture">
+                  <pic:nvPicPr>
+                    <pic:cNvPr id="0" name="task2_normal.png"/>
+                    <pic:cNvPicPr/>
+                  </pic:nvPicPr>
+                  <pic:blipFill>
+                    <a:blip r:embed="rId18"/>
+                    <a:stretch>
+                      <a:fillRect/>
+                    </a:stretch>
+                  </pic:blipFill>
+                  <pic:spPr>
+                    <a:xfrm>
+                      <a:off x="0" y="0"/>
+                      <a:ext cx="5724144" cy="1567403"/>
+                    </a:xfrm>
+                    <a:prstGeom prst="rect">
+                      <a:avLst/>
+                    </a:prstGeom>
+                  </pic:spPr>
+                </pic:pic>
+              </a:graphicData>
+            </a:graphic>
+          </wp:inline>
+        </w:drawing>
+      </w:r>
+    </w:p>
+    <w:p>
+      <w:r>
+        <w:rPr>
+          <w:noProof/>
+        </w:rPr>
+        <w:drawing>
+          <wp:inline distT="0" distB="0" distL="0" distR="0" wp14:anchorId="2D5CBAFC" wp14:editId="597E189B">
+            <wp:extent cx="5724144" cy="1082686"/>
+            <wp:effectExtent l="0" t="0" r="0" b="0"/>
+            <wp:docPr id="15" name="Picture 15"/>
+            <wp:cNvGraphicFramePr>
+              <a:graphicFrameLocks xmlns:a="http://schemas.openxmlformats.org/drawingml/2006/main" noChangeAspect="1"/>
+            </wp:cNvGraphicFramePr>
+            <a:graphic xmlns:a="http://schemas.openxmlformats.org/drawingml/2006/main">
+              <a:graphicData uri="http://schemas.openxmlformats.org/drawingml/2006/picture">
+                <pic:pic xmlns:pic="http://schemas.openxmlformats.org/drawingml/2006/picture">
+                  <pic:nvPicPr>
+                    <pic:cNvPr id="0" name="task2_debug.png"/>
+                    <pic:cNvPicPr/>
+                  </pic:nvPicPr>
+                  <pic:blipFill>
+                    <a:blip r:embed="rId19"/>
+                    <a:stretch>
+                      <a:fillRect/>
+                    </a:stretch>
+                  </pic:blipFill>
+                  <pic:spPr>
+                    <a:xfrm>
+                      <a:off x="0" y="0"/>
+                      <a:ext cx="5724144" cy="1082686"/>
+                    </a:xfrm>
+                    <a:prstGeom prst="rect">
+                      <a:avLst/>
+                    </a:prstGeom>
+                  </pic:spPr>
+                </pic:pic>
+              </a:graphicData>
+            </a:graphic>
+          </wp:inline>
+        </w:drawing>
+      </w:r>
+    </w:p>
+    <w:p>
+      <w:r>
+        <w:t>DEBUG s</w:t>
+      </w:r>
+      <w:r>
+        <w:t xml:space="preserve"> </w:t>
+      </w:r>
+      <w:proofErr w:type="spellStart"/>
+      <w:r>
+        <w:t>hows</w:t>
+      </w:r>
+      <w:proofErr w:type="spellEnd"/>
+      <w:r>
+        <w:t xml:space="preserve"> </w:t>
+      </w:r>
+      <w:r>
+        <w:t xml:space="preserve">the </w:t>
+      </w:r>
+      <w:r>
+        <w:t xml:space="preserve">scaling values and the thresholds 1192.5 and 4933.0. </w:t>
       </w:r>
     </w:p>
     <w:p/>

</xml_diff>

<commit_message>
Task 3 traffic visualisations
</commit_message>
<xml_diff>
--- a/capstone_part2/Part2DeliverablesExecutionOutput.docx
+++ b/capstone_part2/Part2DeliverablesExecutionOutput.docx
@@ -67,16 +67,6 @@
           </wp:inline>
         </w:drawing>
       </w:r>
-    </w:p>
-    <w:p>
-      <w:pPr>
-        <w:spacing w:after="173"/>
-      </w:pPr>
-      <w:r>
-        <w:t>Column check passed. All required columns were present.</w:t>
-      </w:r>
-    </w:p>
-    <w:p>
       <w:r>
         <w:br w:type="page"/>
       </w:r>
@@ -166,10 +156,12 @@
       <w:r>
         <w:t xml:space="preserve"> </w:t>
       </w:r>
+      <w:proofErr w:type="gramStart"/>
       <w:r>
         <w:t>he</w:t>
       </w:r>
       <w:proofErr w:type="spellEnd"/>
+      <w:proofErr w:type="gramEnd"/>
       <w:r>
         <w:t xml:space="preserve"> actual dataset had no missing </w:t>
       </w:r>
@@ -963,6 +955,315 @@
       </w:r>
       <w:r>
         <w:t xml:space="preserve">scaling values and the thresholds 1192.5 and 4933.0. </w:t>
+      </w:r>
+    </w:p>
+    <w:p/>
+    <w:p>
+      <w:r>
+        <w:br w:type="page"/>
+      </w:r>
+    </w:p>
+    <w:p>
+      <w:pPr>
+        <w:keepNext/>
+      </w:pPr>
+      <w:r>
+        <w:rPr>
+          <w:b/>
+        </w:rPr>
+        <w:lastRenderedPageBreak/>
+        <w:t>Task 3: Visualise Traffic Patterns</w:t>
+      </w:r>
+    </w:p>
+    <w:p>
+      <w:r>
+        <w:t xml:space="preserve">Three Matplotlib charts </w:t>
+      </w:r>
+      <w:r>
+        <w:t xml:space="preserve">have </w:t>
+      </w:r>
+      <w:proofErr w:type="spellStart"/>
+      <w:proofErr w:type="gramStart"/>
+      <w:r>
+        <w:t>beensaved</w:t>
+      </w:r>
+      <w:proofErr w:type="spellEnd"/>
+      <w:r>
+        <w:t>.</w:t>
+      </w:r>
+      <w:r>
+        <w:t>.</w:t>
+      </w:r>
+      <w:proofErr w:type="gramEnd"/>
+      <w:r>
+        <w:t xml:space="preserve"> </w:t>
+      </w:r>
+    </w:p>
+    <w:p>
+      <w:pPr>
+        <w:keepNext/>
+      </w:pPr>
+      <w:r>
+        <w:rPr>
+          <w:b/>
+        </w:rPr>
+        <w:t>3.1 Traffic demand by hour</w:t>
+      </w:r>
+    </w:p>
+    <w:p>
+      <w:r>
+        <w:rPr>
+          <w:noProof/>
+        </w:rPr>
+        <w:drawing>
+          <wp:inline distT="0" distB="0" distL="0" distR="0" wp14:anchorId="7F6CB4C1" wp14:editId="085F47ED">
+            <wp:extent cx="5724144" cy="2862072"/>
+            <wp:effectExtent l="0" t="0" r="0" b="0"/>
+            <wp:docPr id="16" name="Picture 16"/>
+            <wp:cNvGraphicFramePr>
+              <a:graphicFrameLocks xmlns:a="http://schemas.openxmlformats.org/drawingml/2006/main" noChangeAspect="1"/>
+            </wp:cNvGraphicFramePr>
+            <a:graphic xmlns:a="http://schemas.openxmlformats.org/drawingml/2006/main">
+              <a:graphicData uri="http://schemas.openxmlformats.org/drawingml/2006/picture">
+                <pic:pic xmlns:pic="http://schemas.openxmlformats.org/drawingml/2006/picture">
+                  <pic:nvPicPr>
+                    <pic:cNvPr id="0" name="traffic_by_hour.png"/>
+                    <pic:cNvPicPr/>
+                  </pic:nvPicPr>
+                  <pic:blipFill>
+                    <a:blip r:embed="rId20"/>
+                    <a:stretch>
+                      <a:fillRect/>
+                    </a:stretch>
+                  </pic:blipFill>
+                  <pic:spPr>
+                    <a:xfrm>
+                      <a:off x="0" y="0"/>
+                      <a:ext cx="5724144" cy="2862072"/>
+                    </a:xfrm>
+                    <a:prstGeom prst="rect">
+                      <a:avLst/>
+                    </a:prstGeom>
+                  </pic:spPr>
+                </pic:pic>
+              </a:graphicData>
+            </a:graphic>
+          </wp:inline>
+        </w:drawing>
+      </w:r>
+    </w:p>
+    <w:p>
+      <w:r>
+        <w:t>Average recorded traffic volume was lowest at 03:00 with 371.09 vehicles, and highest at 16:00 with 5663.76 vehicles. Traffic rises sharply between 05:00 and 07:00 and stays relatively high during the daytime before declining into the evening.</w:t>
+      </w:r>
+      <w:r>
+        <w:br w:type="page"/>
+      </w:r>
+    </w:p>
+    <w:p>
+      <w:pPr>
+        <w:keepNext/>
+      </w:pPr>
+      <w:r>
+        <w:rPr>
+          <w:b/>
+        </w:rPr>
+        <w:lastRenderedPageBreak/>
+        <w:t>3.2 Weekday vs. weekend traffic</w:t>
+      </w:r>
+    </w:p>
+    <w:p>
+      <w:r>
+        <w:rPr>
+          <w:noProof/>
+        </w:rPr>
+        <w:drawing>
+          <wp:inline distT="0" distB="0" distL="0" distR="0" wp14:anchorId="4A5713A8" wp14:editId="0999F597">
+            <wp:extent cx="5724144" cy="4088674"/>
+            <wp:effectExtent l="0" t="0" r="0" b="0"/>
+            <wp:docPr id="17" name="Picture 17"/>
+            <wp:cNvGraphicFramePr>
+              <a:graphicFrameLocks xmlns:a="http://schemas.openxmlformats.org/drawingml/2006/main" noChangeAspect="1"/>
+            </wp:cNvGraphicFramePr>
+            <a:graphic xmlns:a="http://schemas.openxmlformats.org/drawingml/2006/main">
+              <a:graphicData uri="http://schemas.openxmlformats.org/drawingml/2006/picture">
+                <pic:pic xmlns:pic="http://schemas.openxmlformats.org/drawingml/2006/picture">
+                  <pic:nvPicPr>
+                    <pic:cNvPr id="0" name="weekday_weekend_traffic.png"/>
+                    <pic:cNvPicPr/>
+                  </pic:nvPicPr>
+                  <pic:blipFill>
+                    <a:blip r:embed="rId21"/>
+                    <a:stretch>
+                      <a:fillRect/>
+                    </a:stretch>
+                  </pic:blipFill>
+                  <pic:spPr>
+                    <a:xfrm>
+                      <a:off x="0" y="0"/>
+                      <a:ext cx="5724144" cy="4088674"/>
+                    </a:xfrm>
+                    <a:prstGeom prst="rect">
+                      <a:avLst/>
+                    </a:prstGeom>
+                  </pic:spPr>
+                </pic:pic>
+              </a:graphicData>
+            </a:graphic>
+          </wp:inline>
+        </w:drawing>
+      </w:r>
+    </w:p>
+    <w:p>
+      <w:r>
+        <w:t xml:space="preserve">Average recorded traffic volume was 3533.29 on weekdays and 2570.70 on weekends. Weekdays had about 962.59 more vehicles per recorded hour. This is consistent with regular work and school travel, but the chart does not prove the reason for the difference. </w:t>
+      </w:r>
+    </w:p>
+    <w:p>
+      <w:r>
+        <w:br w:type="page"/>
+      </w:r>
+    </w:p>
+    <w:p>
+      <w:pPr>
+        <w:keepNext/>
+      </w:pPr>
+      <w:r>
+        <w:rPr>
+          <w:b/>
+        </w:rPr>
+        <w:lastRenderedPageBreak/>
+        <w:t>3.3 Traffic and weather relationships</w:t>
+      </w:r>
+    </w:p>
+    <w:p>
+      <w:r>
+        <w:rPr>
+          <w:noProof/>
+        </w:rPr>
+        <w:drawing>
+          <wp:inline distT="0" distB="0" distL="0" distR="0" wp14:anchorId="726F685C" wp14:editId="37038EB4">
+            <wp:extent cx="5724144" cy="3816096"/>
+            <wp:effectExtent l="0" t="0" r="0" b="0"/>
+            <wp:docPr id="18" name="Picture 18"/>
+            <wp:cNvGraphicFramePr>
+              <a:graphicFrameLocks xmlns:a="http://schemas.openxmlformats.org/drawingml/2006/main" noChangeAspect="1"/>
+            </wp:cNvGraphicFramePr>
+            <a:graphic xmlns:a="http://schemas.openxmlformats.org/drawingml/2006/main">
+              <a:graphicData uri="http://schemas.openxmlformats.org/drawingml/2006/picture">
+                <pic:pic xmlns:pic="http://schemas.openxmlformats.org/drawingml/2006/picture">
+                  <pic:nvPicPr>
+                    <pic:cNvPr id="0" name="traffic_by_weather.png"/>
+                    <pic:cNvPicPr/>
+                  </pic:nvPicPr>
+                  <pic:blipFill>
+                    <a:blip r:embed="rId22"/>
+                    <a:stretch>
+                      <a:fillRect/>
+                    </a:stretch>
+                  </pic:blipFill>
+                  <pic:spPr>
+                    <a:xfrm>
+                      <a:off x="0" y="0"/>
+                      <a:ext cx="5724144" cy="3816096"/>
+                    </a:xfrm>
+                    <a:prstGeom prst="rect">
+                      <a:avLst/>
+                    </a:prstGeom>
+                  </pic:spPr>
+                </pic:pic>
+              </a:graphicData>
+            </a:graphic>
+          </wp:inline>
+        </w:drawing>
+      </w:r>
+    </w:p>
+    <w:p>
+      <w:r>
+        <w:t xml:space="preserve">Clouds had the </w:t>
+      </w:r>
+      <w:proofErr w:type="spellStart"/>
+      <w:r>
+        <w:t>hig</w:t>
+      </w:r>
+      <w:proofErr w:type="spellEnd"/>
+      <w:r>
+        <w:t xml:space="preserve"> </w:t>
+      </w:r>
+      <w:proofErr w:type="spellStart"/>
+      <w:r>
+        <w:t>hest</w:t>
+      </w:r>
+      <w:proofErr w:type="spellEnd"/>
+      <w:r>
+        <w:t xml:space="preserve"> average recorded traffic volume at 3617.99, from 15158 records. Squall had the lowest average at 2061.75, from </w:t>
+      </w:r>
+      <w:proofErr w:type="spellStart"/>
+      <w:r>
+        <w:t>ony</w:t>
+      </w:r>
+      <w:proofErr w:type="spellEnd"/>
+      <w:r>
+        <w:t xml:space="preserve"> 4 records. Smoke also had few records, with 20 observations. The weather summary includes both averages and record counts. </w:t>
+      </w:r>
+    </w:p>
+    <w:p>
+      <w:r>
+        <w:br w:type="page"/>
+      </w:r>
+    </w:p>
+    <w:p>
+      <w:pPr>
+        <w:keepNext/>
+      </w:pPr>
+      <w:r>
+        <w:rPr>
+          <w:b/>
+        </w:rPr>
+        <w:lastRenderedPageBreak/>
+        <w:t>3.4 Script execution and logging requirement</w:t>
+      </w:r>
+    </w:p>
+    <w:p>
+      <w:r>
+        <w:rPr>
+          <w:noProof/>
+        </w:rPr>
+        <w:drawing>
+          <wp:inline distT="0" distB="0" distL="0" distR="0" wp14:anchorId="1E865DD8" wp14:editId="23CAE1C4">
+            <wp:extent cx="5724144" cy="796601"/>
+            <wp:effectExtent l="0" t="0" r="0" b="0"/>
+            <wp:docPr id="19" name="Picture 19"/>
+            <wp:cNvGraphicFramePr>
+              <a:graphicFrameLocks xmlns:a="http://schemas.openxmlformats.org/drawingml/2006/main" noChangeAspect="1"/>
+            </wp:cNvGraphicFramePr>
+            <a:graphic xmlns:a="http://schemas.openxmlformats.org/drawingml/2006/main">
+              <a:graphicData uri="http://schemas.openxmlformats.org/drawingml/2006/picture">
+                <pic:pic xmlns:pic="http://schemas.openxmlformats.org/drawingml/2006/picture">
+                  <pic:nvPicPr>
+                    <pic:cNvPr id="0" name="task3_run.png"/>
+                    <pic:cNvPicPr/>
+                  </pic:nvPicPr>
+                  <pic:blipFill>
+                    <a:blip r:embed="rId23"/>
+                    <a:stretch>
+                      <a:fillRect/>
+                    </a:stretch>
+                  </pic:blipFill>
+                  <pic:spPr>
+                    <a:xfrm>
+                      <a:off x="0" y="0"/>
+                      <a:ext cx="5724144" cy="796601"/>
+                    </a:xfrm>
+                    <a:prstGeom prst="rect">
+                      <a:avLst/>
+                    </a:prstGeom>
+                  </pic:spPr>
+                </pic:pic>
+              </a:graphicData>
+            </a:graphic>
+          </wp:inline>
+        </w:drawing>
       </w:r>
     </w:p>
     <w:p/>

</xml_diff>

<commit_message>
Task 5 GitHub and Reproducibility
</commit_message>
<xml_diff>
--- a/capstone_part2/Part2DeliverablesExecutionOutput.docx
+++ b/capstone_part2/Part2DeliverablesExecutionOutput.docx
@@ -1254,6 +1254,519 @@
                     <a:xfrm>
                       <a:off x="0" y="0"/>
                       <a:ext cx="5724144" cy="796601"/>
+                    </a:xfrm>
+                    <a:prstGeom prst="rect">
+                      <a:avLst/>
+                    </a:prstGeom>
+                  </pic:spPr>
+                </pic:pic>
+              </a:graphicData>
+            </a:graphic>
+          </wp:inline>
+        </w:drawing>
+      </w:r>
+    </w:p>
+    <w:p/>
+    <w:p>
+      <w:r>
+        <w:br w:type="page"/>
+      </w:r>
+    </w:p>
+    <w:p>
+      <w:pPr>
+        <w:keepNext/>
+      </w:pPr>
+      <w:r>
+        <w:rPr>
+          <w:b/>
+        </w:rPr>
+        <w:lastRenderedPageBreak/>
+        <w:t>Task 4: Build a Mini Traffic Analytics Application</w:t>
+      </w:r>
+    </w:p>
+    <w:p>
+      <w:pPr>
+        <w:keepNext/>
+      </w:pPr>
+      <w:r>
+        <w:rPr>
+          <w:b/>
+        </w:rPr>
+        <w:t>4.1 Compare weekday and weekend traffic</w:t>
+      </w:r>
+    </w:p>
+    <w:p>
+      <w:r>
+        <w:t>Command: python traffic_app.py compare-days</w:t>
+      </w:r>
+    </w:p>
+    <w:p>
+      <w:r>
+        <w:rPr>
+          <w:noProof/>
+        </w:rPr>
+        <w:drawing>
+          <wp:inline distT="0" distB="0" distL="0" distR="0" wp14:anchorId="122C8C86" wp14:editId="521799AA">
+            <wp:extent cx="5724144" cy="1022714"/>
+            <wp:effectExtent l="0" t="0" r="0" b="0"/>
+            <wp:docPr id="20" name="Picture 20"/>
+            <wp:cNvGraphicFramePr>
+              <a:graphicFrameLocks xmlns:a="http://schemas.openxmlformats.org/drawingml/2006/main" noChangeAspect="1"/>
+            </wp:cNvGraphicFramePr>
+            <a:graphic xmlns:a="http://schemas.openxmlformats.org/drawingml/2006/main">
+              <a:graphicData uri="http://schemas.openxmlformats.org/drawingml/2006/picture">
+                <pic:pic xmlns:pic="http://schemas.openxmlformats.org/drawingml/2006/picture">
+                  <pic:nvPicPr>
+                    <pic:cNvPr id="0" name="task4_compare.png"/>
+                    <pic:cNvPicPr/>
+                  </pic:nvPicPr>
+                  <pic:blipFill>
+                    <a:blip r:embed="rId24"/>
+                    <a:stretch>
+                      <a:fillRect/>
+                    </a:stretch>
+                  </pic:blipFill>
+                  <pic:spPr>
+                    <a:xfrm>
+                      <a:off x="0" y="0"/>
+                      <a:ext cx="5724144" cy="1022714"/>
+                    </a:xfrm>
+                    <a:prstGeom prst="rect">
+                      <a:avLst/>
+                    </a:prstGeom>
+                  </pic:spPr>
+                </pic:pic>
+              </a:graphicData>
+            </a:graphic>
+          </wp:inline>
+        </w:drawing>
+      </w:r>
+    </w:p>
+    <w:p>
+      <w:r>
+        <w:t>The weekday average is 3533.29 from 34487 records. The weekend average is 2570.70 from 13700 records. These values match the chart</w:t>
+      </w:r>
+    </w:p>
+    <w:p>
+      <w:pPr>
+        <w:keepNext/>
+      </w:pPr>
+      <w:r>
+        <w:rPr>
+          <w:b/>
+        </w:rPr>
+        <w:t>4.2 Query a specific date and time</w:t>
+      </w:r>
+    </w:p>
+    <w:p>
+      <w:r>
+        <w:t>Command: python traffic_app.py query --datetime "2012-10-02 09:00:00"</w:t>
+      </w:r>
+    </w:p>
+    <w:p>
+      <w:r>
+        <w:rPr>
+          <w:noProof/>
+        </w:rPr>
+        <w:drawing>
+          <wp:inline distT="0" distB="0" distL="0" distR="0" wp14:anchorId="6E6EF64E" wp14:editId="31EC0F97">
+            <wp:extent cx="5724144" cy="875680"/>
+            <wp:effectExtent l="0" t="0" r="0" b="0"/>
+            <wp:docPr id="21" name="Picture 21"/>
+            <wp:cNvGraphicFramePr>
+              <a:graphicFrameLocks xmlns:a="http://schemas.openxmlformats.org/drawingml/2006/main" noChangeAspect="1"/>
+            </wp:cNvGraphicFramePr>
+            <a:graphic xmlns:a="http://schemas.openxmlformats.org/drawingml/2006/main">
+              <a:graphicData uri="http://schemas.openxmlformats.org/drawingml/2006/picture">
+                <pic:pic xmlns:pic="http://schemas.openxmlformats.org/drawingml/2006/picture">
+                  <pic:nvPicPr>
+                    <pic:cNvPr id="0" name="task4_query.png"/>
+                    <pic:cNvPicPr/>
+                  </pic:nvPicPr>
+                  <pic:blipFill>
+                    <a:blip r:embed="rId25"/>
+                    <a:stretch>
+                      <a:fillRect/>
+                    </a:stretch>
+                  </pic:blipFill>
+                  <pic:spPr>
+                    <a:xfrm>
+                      <a:off x="0" y="0"/>
+                      <a:ext cx="5724144" cy="875680"/>
+                    </a:xfrm>
+                    <a:prstGeom prst="rect">
+                      <a:avLst/>
+                    </a:prstGeom>
+                  </pic:spPr>
+                </pic:pic>
+              </a:graphicData>
+            </a:graphic>
+          </wp:inline>
+        </w:drawing>
+      </w:r>
+    </w:p>
+    <w:p>
+      <w:r>
+        <w:t xml:space="preserve">The query returned one record with traffic volume 5545 and category High. The weather was Clouds with scattered clouds. Temperature was 288.28 Kelvin, and rainfall and snowfall were both 0.0. </w:t>
+      </w:r>
+    </w:p>
+    <w:p>
+      <w:r>
+        <w:br w:type="page"/>
+      </w:r>
+    </w:p>
+    <w:p>
+      <w:pPr>
+        <w:keepNext/>
+      </w:pPr>
+      <w:r>
+        <w:rPr>
+          <w:b/>
+        </w:rPr>
+        <w:lastRenderedPageBreak/>
+        <w:t>4.3 Find traffic above a chosen threshold</w:t>
+      </w:r>
+    </w:p>
+    <w:p>
+      <w:r>
+        <w:t>Command: python traffic_app.py high-traffic --threshold 7000</w:t>
+      </w:r>
+    </w:p>
+    <w:p>
+      <w:r>
+        <w:t xml:space="preserve">The results show records above 7000, sorted from highest to lowest traffic volume. The highest value shown is 7280. </w:t>
+      </w:r>
+    </w:p>
+    <w:p>
+      <w:r>
+        <w:rPr>
+          <w:noProof/>
+        </w:rPr>
+        <w:drawing>
+          <wp:inline distT="0" distB="0" distL="0" distR="0" wp14:anchorId="481ED412" wp14:editId="61BA8390">
+            <wp:extent cx="5724144" cy="2357892"/>
+            <wp:effectExtent l="0" t="0" r="0" b="0"/>
+            <wp:docPr id="22" name="Picture 22"/>
+            <wp:cNvGraphicFramePr>
+              <a:graphicFrameLocks xmlns:a="http://schemas.openxmlformats.org/drawingml/2006/main" noChangeAspect="1"/>
+            </wp:cNvGraphicFramePr>
+            <a:graphic xmlns:a="http://schemas.openxmlformats.org/drawingml/2006/main">
+              <a:graphicData uri="http://schemas.openxmlformats.org/drawingml/2006/picture">
+                <pic:pic xmlns:pic="http://schemas.openxmlformats.org/drawingml/2006/picture">
+                  <pic:nvPicPr>
+                    <pic:cNvPr id="0" name="task4_high_traffic_1.png"/>
+                    <pic:cNvPicPr/>
+                  </pic:nvPicPr>
+                  <pic:blipFill>
+                    <a:blip r:embed="rId26"/>
+                    <a:stretch>
+                      <a:fillRect/>
+                    </a:stretch>
+                  </pic:blipFill>
+                  <pic:spPr>
+                    <a:xfrm>
+                      <a:off x="0" y="0"/>
+                      <a:ext cx="5724144" cy="2357892"/>
+                    </a:xfrm>
+                    <a:prstGeom prst="rect">
+                      <a:avLst/>
+                    </a:prstGeom>
+                  </pic:spPr>
+                </pic:pic>
+              </a:graphicData>
+            </a:graphic>
+          </wp:inline>
+        </w:drawing>
+      </w:r>
+    </w:p>
+    <w:p>
+      <w:r>
+        <w:br w:type="page"/>
+      </w:r>
+    </w:p>
+    <w:p>
+      <w:pPr>
+        <w:keepNext/>
+      </w:pPr>
+      <w:r>
+        <w:rPr>
+          <w:b/>
+        </w:rPr>
+        <w:lastRenderedPageBreak/>
+        <w:t>4.3 High-traffic results continued</w:t>
+      </w:r>
+    </w:p>
+    <w:p>
+      <w:r>
+        <w:rPr>
+          <w:noProof/>
+        </w:rPr>
+        <w:drawing>
+          <wp:inline distT="0" distB="0" distL="0" distR="0" wp14:anchorId="4B562106" wp14:editId="423DCABB">
+            <wp:extent cx="5724144" cy="2323775"/>
+            <wp:effectExtent l="0" t="0" r="0" b="0"/>
+            <wp:docPr id="23" name="Picture 23"/>
+            <wp:cNvGraphicFramePr>
+              <a:graphicFrameLocks xmlns:a="http://schemas.openxmlformats.org/drawingml/2006/main" noChangeAspect="1"/>
+            </wp:cNvGraphicFramePr>
+            <a:graphic xmlns:a="http://schemas.openxmlformats.org/drawingml/2006/main">
+              <a:graphicData uri="http://schemas.openxmlformats.org/drawingml/2006/picture">
+                <pic:pic xmlns:pic="http://schemas.openxmlformats.org/drawingml/2006/picture">
+                  <pic:nvPicPr>
+                    <pic:cNvPr id="0" name="task4_high_traffic_2.png"/>
+                    <pic:cNvPicPr/>
+                  </pic:nvPicPr>
+                  <pic:blipFill>
+                    <a:blip r:embed="rId27"/>
+                    <a:stretch>
+                      <a:fillRect/>
+                    </a:stretch>
+                  </pic:blipFill>
+                  <pic:spPr>
+                    <a:xfrm>
+                      <a:off x="0" y="0"/>
+                      <a:ext cx="5724144" cy="2323775"/>
+                    </a:xfrm>
+                    <a:prstGeom prst="rect">
+                      <a:avLst/>
+                    </a:prstGeom>
+                  </pic:spPr>
+                </pic:pic>
+              </a:graphicData>
+            </a:graphic>
+          </wp:inline>
+        </w:drawing>
+      </w:r>
+    </w:p>
+    <w:p>
+      <w:r>
+        <w:br w:type="page"/>
+      </w:r>
+    </w:p>
+    <w:p>
+      <w:pPr>
+        <w:keepNext/>
+      </w:pPr>
+      <w:r>
+        <w:rPr>
+          <w:b/>
+        </w:rPr>
+        <w:lastRenderedPageBreak/>
+        <w:t>4.4 Handle an invalid date</w:t>
+      </w:r>
+    </w:p>
+    <w:p>
+      <w:r>
+        <w:t>Command: python traffic_app.py query --datetime "invalid-date"</w:t>
+      </w:r>
+    </w:p>
+    <w:p>
+      <w:r>
+        <w:rPr>
+          <w:noProof/>
+        </w:rPr>
+        <w:drawing>
+          <wp:inline distT="0" distB="0" distL="0" distR="0" wp14:anchorId="579742D2" wp14:editId="60EB58CA">
+            <wp:extent cx="5724144" cy="515173"/>
+            <wp:effectExtent l="0" t="0" r="0" b="0"/>
+            <wp:docPr id="24" name="Picture 24"/>
+            <wp:cNvGraphicFramePr>
+              <a:graphicFrameLocks xmlns:a="http://schemas.openxmlformats.org/drawingml/2006/main" noChangeAspect="1"/>
+            </wp:cNvGraphicFramePr>
+            <a:graphic xmlns:a="http://schemas.openxmlformats.org/drawingml/2006/main">
+              <a:graphicData uri="http://schemas.openxmlformats.org/drawingml/2006/picture">
+                <pic:pic xmlns:pic="http://schemas.openxmlformats.org/drawingml/2006/picture">
+                  <pic:nvPicPr>
+                    <pic:cNvPr id="0" name="task4_invalid_date.png"/>
+                    <pic:cNvPicPr/>
+                  </pic:nvPicPr>
+                  <pic:blipFill>
+                    <a:blip r:embed="rId28"/>
+                    <a:stretch>
+                      <a:fillRect/>
+                    </a:stretch>
+                  </pic:blipFill>
+                  <pic:spPr>
+                    <a:xfrm>
+                      <a:off x="0" y="0"/>
+                      <a:ext cx="5724144" cy="515173"/>
+                    </a:xfrm>
+                    <a:prstGeom prst="rect">
+                      <a:avLst/>
+                    </a:prstGeom>
+                  </pic:spPr>
+                </pic:pic>
+              </a:graphicData>
+            </a:graphic>
+          </wp:inline>
+        </w:drawing>
+      </w:r>
+    </w:p>
+    <w:p>
+      <w:r>
+        <w:t xml:space="preserve">The application showed a clear ERROR </w:t>
+      </w:r>
+      <w:proofErr w:type="gramStart"/>
+      <w:r>
+        <w:t xml:space="preserve">explaining </w:t>
+      </w:r>
+      <w:r>
+        <w:t xml:space="preserve"> how</w:t>
+      </w:r>
+      <w:proofErr w:type="gramEnd"/>
+      <w:r>
+        <w:t xml:space="preserve"> </w:t>
+      </w:r>
+      <w:r>
+        <w:t xml:space="preserve">the date and time </w:t>
+      </w:r>
+      <w:proofErr w:type="spellStart"/>
+      <w:r>
+        <w:t>sjhoupd</w:t>
+      </w:r>
+      <w:proofErr w:type="spellEnd"/>
+      <w:r>
+        <w:t xml:space="preserve"> look like</w:t>
+      </w:r>
+      <w:r>
+        <w:t xml:space="preserve">. </w:t>
+      </w:r>
+    </w:p>
+    <w:p>
+      <w:r>
+        <w:rPr>
+          <w:noProof/>
+        </w:rPr>
+        <w:drawing>
+          <wp:inline distT="0" distB="0" distL="0" distR="0" wp14:anchorId="3FBA29CE" wp14:editId="63E2974E">
+            <wp:extent cx="5724144" cy="83954"/>
+            <wp:effectExtent l="0" t="0" r="0" b="0"/>
+            <wp:docPr id="25" name="Picture 25"/>
+            <wp:cNvGraphicFramePr>
+              <a:graphicFrameLocks xmlns:a="http://schemas.openxmlformats.org/drawingml/2006/main" noChangeAspect="1"/>
+            </wp:cNvGraphicFramePr>
+            <a:graphic xmlns:a="http://schemas.openxmlformats.org/drawingml/2006/main">
+              <a:graphicData uri="http://schemas.openxmlformats.org/drawingml/2006/picture">
+                <pic:pic xmlns:pic="http://schemas.openxmlformats.org/drawingml/2006/picture">
+                  <pic:nvPicPr>
+                    <pic:cNvPr id="0" name="task4_invalid_date_exit.png"/>
+                    <pic:cNvPicPr/>
+                  </pic:nvPicPr>
+                  <pic:blipFill>
+                    <a:blip r:embed="rId29"/>
+                    <a:stretch>
+                      <a:fillRect/>
+                    </a:stretch>
+                  </pic:blipFill>
+                  <pic:spPr>
+                    <a:xfrm>
+                      <a:off x="0" y="0"/>
+                      <a:ext cx="5724144" cy="83954"/>
+                    </a:xfrm>
+                    <a:prstGeom prst="rect">
+                      <a:avLst/>
+                    </a:prstGeom>
+                  </pic:spPr>
+                </pic:pic>
+              </a:graphicData>
+            </a:graphic>
+          </wp:inline>
+        </w:drawing>
+      </w:r>
+    </w:p>
+    <w:p>
+      <w:pPr>
+        <w:keepNext/>
+      </w:pPr>
+      <w:r>
+        <w:rPr>
+          <w:b/>
+        </w:rPr>
+        <w:t>4.5 Handle an invalid threshold argument</w:t>
+      </w:r>
+    </w:p>
+    <w:p>
+      <w:r>
+        <w:t>Command: python traffic_app.py high-traffic --threshold abc</w:t>
+      </w:r>
+    </w:p>
+    <w:p>
+      <w:r>
+        <w:rPr>
+          <w:noProof/>
+        </w:rPr>
+        <w:drawing>
+          <wp:inline distT="0" distB="0" distL="0" distR="0" wp14:anchorId="06D37284" wp14:editId="78DCE9FF">
+            <wp:extent cx="5724144" cy="127203"/>
+            <wp:effectExtent l="0" t="0" r="0" b="0"/>
+            <wp:docPr id="26" name="Picture 26"/>
+            <wp:cNvGraphicFramePr>
+              <a:graphicFrameLocks xmlns:a="http://schemas.openxmlformats.org/drawingml/2006/main" noChangeAspect="1"/>
+            </wp:cNvGraphicFramePr>
+            <a:graphic xmlns:a="http://schemas.openxmlformats.org/drawingml/2006/main">
+              <a:graphicData uri="http://schemas.openxmlformats.org/drawingml/2006/picture">
+                <pic:pic xmlns:pic="http://schemas.openxmlformats.org/drawingml/2006/picture">
+                  <pic:nvPicPr>
+                    <pic:cNvPr id="0" name="task4_invalid_argument.png"/>
+                    <pic:cNvPicPr/>
+                  </pic:nvPicPr>
+                  <pic:blipFill>
+                    <a:blip r:embed="rId30"/>
+                    <a:stretch>
+                      <a:fillRect/>
+                    </a:stretch>
+                  </pic:blipFill>
+                  <pic:spPr>
+                    <a:xfrm>
+                      <a:off x="0" y="0"/>
+                      <a:ext cx="5724144" cy="127203"/>
+                    </a:xfrm>
+                    <a:prstGeom prst="rect">
+                      <a:avLst/>
+                    </a:prstGeom>
+                  </pic:spPr>
+                </pic:pic>
+              </a:graphicData>
+            </a:graphic>
+          </wp:inline>
+        </w:drawing>
+      </w:r>
+    </w:p>
+    <w:p>
+      <w:r>
+        <w:t xml:space="preserve">The application showed a clear ERROR because the threshold must be an integer. </w:t>
+      </w:r>
+    </w:p>
+    <w:p>
+      <w:r>
+        <w:rPr>
+          <w:noProof/>
+        </w:rPr>
+        <w:drawing>
+          <wp:inline distT="0" distB="0" distL="0" distR="0" wp14:anchorId="4E09D6BE" wp14:editId="6A8021A5">
+            <wp:extent cx="5724144" cy="69962"/>
+            <wp:effectExtent l="0" t="0" r="0" b="0"/>
+            <wp:docPr id="27" name="Picture 27"/>
+            <wp:cNvGraphicFramePr>
+              <a:graphicFrameLocks xmlns:a="http://schemas.openxmlformats.org/drawingml/2006/main" noChangeAspect="1"/>
+            </wp:cNvGraphicFramePr>
+            <a:graphic xmlns:a="http://schemas.openxmlformats.org/drawingml/2006/main">
+              <a:graphicData uri="http://schemas.openxmlformats.org/drawingml/2006/picture">
+                <pic:pic xmlns:pic="http://schemas.openxmlformats.org/drawingml/2006/picture">
+                  <pic:nvPicPr>
+                    <pic:cNvPr id="0" name="task4_invalid_argument_exit.png"/>
+                    <pic:cNvPicPr/>
+                  </pic:nvPicPr>
+                  <pic:blipFill>
+                    <a:blip r:embed="rId31"/>
+                    <a:stretch>
+                      <a:fillRect/>
+                    </a:stretch>
+                  </pic:blipFill>
+                  <pic:spPr>
+                    <a:xfrm>
+                      <a:off x="0" y="0"/>
+                      <a:ext cx="5724144" cy="69962"/>
                     </a:xfrm>
                     <a:prstGeom prst="rect">
                       <a:avLst/>

</xml_diff>

<commit_message>
Re-Organise Part 2 deliverable execution output and Short Report more readabel.
</commit_message>
<xml_diff>
--- a/capstone_part2/Part2DeliverablesExecutionOutput.docx
+++ b/capstone_part2/Part2DeliverablesExecutionOutput.docx
@@ -4,29 +4,24 @@
   <w:body>
     <w:p>
       <w:pPr>
-        <w:keepNext/>
-      </w:pPr>
-      <w:r>
-        <w:rPr>
-          <w:b/>
-          <w:color w:val="000000"/>
-        </w:rPr>
+        <w:pStyle w:val="Heading1"/>
+      </w:pPr>
+      <w:r>
         <w:t xml:space="preserve">Task 1: Data Pipeline Construction </w:t>
       </w:r>
     </w:p>
     <w:p>
       <w:pPr>
-        <w:keepNext/>
-      </w:pPr>
-      <w:r>
-        <w:rPr>
-          <w:b/>
-          <w:color w:val="000000"/>
-        </w:rPr>
+        <w:pStyle w:val="Heading2"/>
+      </w:pPr>
+      <w:r>
         <w:t>1.1 Load the dataset and check the columns</w:t>
       </w:r>
     </w:p>
     <w:p>
+      <w:pPr>
+        <w:pStyle w:val="Heading2"/>
+      </w:pPr>
       <w:r>
         <w:rPr>
           <w:noProof/>
@@ -71,10 +66,6 @@
         <w:br w:type="page"/>
       </w:r>
       <w:r>
-        <w:rPr>
-          <w:b/>
-          <w:color w:val="000000"/>
-        </w:rPr>
         <w:lastRenderedPageBreak/>
         <w:t>1.2 Make category text consistent and convert dates</w:t>
       </w:r>
@@ -122,9 +113,6 @@
       </w:r>
     </w:p>
     <w:p>
-      <w:pPr>
-        <w:spacing w:after="173"/>
-      </w:pPr>
       <w:r>
         <w:t xml:space="preserve">The notebook reports 1730 changes in </w:t>
       </w:r>
@@ -156,12 +144,10 @@
       <w:r>
         <w:t xml:space="preserve"> </w:t>
       </w:r>
-      <w:proofErr w:type="gramStart"/>
       <w:r>
         <w:t>he</w:t>
       </w:r>
       <w:proofErr w:type="spellEnd"/>
-      <w:proofErr w:type="gramEnd"/>
       <w:r>
         <w:t xml:space="preserve"> actual dataset had no missing </w:t>
       </w:r>
@@ -223,14 +209,13 @@
       </w:r>
     </w:p>
     <w:p>
+      <w:pPr>
+        <w:pStyle w:val="Heading2"/>
+      </w:pPr>
       <w:r>
         <w:br w:type="page"/>
       </w:r>
       <w:r>
-        <w:rPr>
-          <w:b/>
-          <w:color w:val="000000"/>
-        </w:rPr>
         <w:lastRenderedPageBreak/>
         <w:t>1.3 Remove exact duplicates and fix invalid readings</w:t>
       </w:r>
@@ -283,11 +268,10 @@
       </w:r>
     </w:p>
     <w:p>
-      <w:r>
-        <w:rPr>
-          <w:b/>
-          <w:color w:val="000000"/>
-        </w:rPr>
+      <w:pPr>
+        <w:pStyle w:val="Heading2"/>
+      </w:pPr>
+      <w:r>
         <w:t>1.4 Validate and save the cleaned dataset</w:t>
       </w:r>
     </w:p>
@@ -345,13 +329,9 @@
     </w:p>
     <w:p>
       <w:pPr>
-        <w:keepNext/>
-      </w:pPr>
-      <w:r>
-        <w:rPr>
-          <w:b/>
-          <w:color w:val="000000"/>
-        </w:rPr>
+        <w:pStyle w:val="Heading2"/>
+      </w:pPr>
+      <w:r>
         <w:lastRenderedPageBreak/>
         <w:t>1.5 Run the standalone pipeline</w:t>
       </w:r>
@@ -400,13 +380,9 @@
     </w:p>
     <w:p>
       <w:pPr>
-        <w:keepNext/>
-      </w:pPr>
-      <w:r>
-        <w:rPr>
-          <w:b/>
-          <w:color w:val="000000"/>
-        </w:rPr>
+        <w:pStyle w:val="Heading2"/>
+      </w:pPr>
+      <w:r>
         <w:t>1.6 Check logging in debug mode</w:t>
       </w:r>
     </w:p>
@@ -453,39 +429,25 @@
       </w:r>
     </w:p>
     <w:p>
-      <w:pPr>
-        <w:spacing w:after="173"/>
-      </w:pPr>
-      <w:r>
-        <w:t>Debug mode shows the monthly medians and the pipeline completes successfully.</w:t>
-      </w:r>
-    </w:p>
-    <w:p/>
-    <w:p>
       <w:r>
         <w:br w:type="page"/>
       </w:r>
     </w:p>
     <w:p>
       <w:pPr>
-        <w:keepNext/>
-      </w:pPr>
-      <w:r>
-        <w:rPr>
-          <w:b/>
-        </w:rPr>
+        <w:pStyle w:val="Heading1"/>
+        <w:pageBreakBefore/>
+      </w:pPr>
+      <w:r>
         <w:lastRenderedPageBreak/>
         <w:t xml:space="preserve">Task 2: Feature Engineering </w:t>
       </w:r>
     </w:p>
     <w:p>
       <w:pPr>
-        <w:keepNext/>
-      </w:pPr>
-      <w:r>
-        <w:rPr>
-          <w:b/>
-        </w:rPr>
+        <w:pStyle w:val="Heading2"/>
+      </w:pPr>
+      <w:r>
         <w:t>2.1 Time features</w:t>
       </w:r>
     </w:p>
@@ -543,12 +505,9 @@
     </w:p>
     <w:p>
       <w:pPr>
-        <w:keepNext/>
-      </w:pPr>
-      <w:r>
-        <w:rPr>
-          <w:b/>
-        </w:rPr>
+        <w:pStyle w:val="Heading2"/>
+      </w:pPr>
+      <w:r>
         <w:lastRenderedPageBreak/>
         <w:t>2.2 Cyclical encoding and weather features</w:t>
       </w:r>
@@ -649,12 +608,9 @@
     </w:p>
     <w:p>
       <w:pPr>
-        <w:keepNext/>
-      </w:pPr>
-      <w:r>
-        <w:rPr>
-          <w:b/>
-        </w:rPr>
+        <w:pStyle w:val="Heading2"/>
+      </w:pPr>
+      <w:r>
         <w:lastRenderedPageBreak/>
         <w:t>2.3 Numerical features</w:t>
       </w:r>
@@ -713,12 +669,9 @@
     </w:p>
     <w:p>
       <w:pPr>
-        <w:keepNext/>
-      </w:pPr>
-      <w:r>
-        <w:rPr>
-          <w:b/>
-        </w:rPr>
+        <w:pStyle w:val="Heading2"/>
+      </w:pPr>
+      <w:r>
         <w:lastRenderedPageBreak/>
         <w:t>2.4 Traffic target</w:t>
       </w:r>
@@ -782,12 +735,9 @@
     </w:p>
     <w:p>
       <w:pPr>
-        <w:keepNext/>
-      </w:pPr>
-      <w:r>
-        <w:rPr>
-          <w:b/>
-        </w:rPr>
+        <w:pStyle w:val="Heading2"/>
+      </w:pPr>
+      <w:r>
         <w:lastRenderedPageBreak/>
         <w:t>2.5 Validate and save the features</w:t>
       </w:r>
@@ -841,12 +791,9 @@
     </w:p>
     <w:p>
       <w:pPr>
-        <w:keepNext/>
-      </w:pPr>
-      <w:r>
-        <w:rPr>
-          <w:b/>
-        </w:rPr>
+        <w:pStyle w:val="Heading2"/>
+      </w:pPr>
+      <w:r>
         <w:lastRenderedPageBreak/>
         <w:t>2.6 Run the standalone script and check logging</w:t>
       </w:r>
@@ -957,7 +904,6 @@
         <w:t xml:space="preserve">scaling values and the thresholds 1192.5 and 4933.0. </w:t>
       </w:r>
     </w:p>
-    <w:p/>
     <w:p>
       <w:r>
         <w:br w:type="page"/>
@@ -965,12 +911,10 @@
     </w:p>
     <w:p>
       <w:pPr>
-        <w:keepNext/>
-      </w:pPr>
-      <w:r>
-        <w:rPr>
-          <w:b/>
-        </w:rPr>
+        <w:pStyle w:val="Heading1"/>
+        <w:pageBreakBefore/>
+      </w:pPr>
+      <w:r>
         <w:lastRenderedPageBreak/>
         <w:t>Task 3: Visualise Traffic Patterns</w:t>
       </w:r>
@@ -983,7 +927,6 @@
         <w:t xml:space="preserve">have </w:t>
       </w:r>
       <w:proofErr w:type="spellStart"/>
-      <w:proofErr w:type="gramStart"/>
       <w:r>
         <w:t>beensaved</w:t>
       </w:r>
@@ -992,21 +935,14 @@
         <w:t>.</w:t>
       </w:r>
       <w:r>
-        <w:t>.</w:t>
-      </w:r>
-      <w:proofErr w:type="gramEnd"/>
-      <w:r>
-        <w:t xml:space="preserve"> </w:t>
-      </w:r>
-    </w:p>
-    <w:p>
-      <w:pPr>
-        <w:keepNext/>
-      </w:pPr>
-      <w:r>
-        <w:rPr>
-          <w:b/>
-        </w:rPr>
+        <w:t xml:space="preserve">. </w:t>
+      </w:r>
+    </w:p>
+    <w:p>
+      <w:pPr>
+        <w:pStyle w:val="Heading2"/>
+      </w:pPr>
+      <w:r>
         <w:t>3.1 Traffic demand by hour</w:t>
       </w:r>
     </w:p>
@@ -1062,12 +998,9 @@
     </w:p>
     <w:p>
       <w:pPr>
-        <w:keepNext/>
-      </w:pPr>
-      <w:r>
-        <w:rPr>
-          <w:b/>
-        </w:rPr>
+        <w:pStyle w:val="Heading2"/>
+      </w:pPr>
+      <w:r>
         <w:lastRenderedPageBreak/>
         <w:t>3.2 Weekday vs. weekend traffic</w:t>
       </w:r>
@@ -1126,12 +1059,9 @@
     </w:p>
     <w:p>
       <w:pPr>
-        <w:keepNext/>
-      </w:pPr>
-      <w:r>
-        <w:rPr>
-          <w:b/>
-        </w:rPr>
+        <w:pStyle w:val="Heading2"/>
+      </w:pPr>
+      <w:r>
         <w:lastRenderedPageBreak/>
         <w:t>3.3 Traffic and weather relationships</w:t>
       </w:r>
@@ -1214,12 +1144,9 @@
     </w:p>
     <w:p>
       <w:pPr>
-        <w:keepNext/>
-      </w:pPr>
-      <w:r>
-        <w:rPr>
-          <w:b/>
-        </w:rPr>
+        <w:pStyle w:val="Heading2"/>
+      </w:pPr>
+      <w:r>
         <w:lastRenderedPageBreak/>
         <w:t>3.4 Script execution and logging requirement</w:t>
       </w:r>
@@ -1266,7 +1193,6 @@
         </w:drawing>
       </w:r>
     </w:p>
-    <w:p/>
     <w:p>
       <w:r>
         <w:br w:type="page"/>
@@ -1274,24 +1200,19 @@
     </w:p>
     <w:p>
       <w:pPr>
-        <w:keepNext/>
-      </w:pPr>
-      <w:r>
-        <w:rPr>
-          <w:b/>
-        </w:rPr>
+        <w:pStyle w:val="Heading1"/>
+        <w:pageBreakBefore/>
+      </w:pPr>
+      <w:r>
         <w:lastRenderedPageBreak/>
         <w:t>Task 4: Build a Mini Traffic Analytics Application</w:t>
       </w:r>
     </w:p>
     <w:p>
       <w:pPr>
-        <w:keepNext/>
-      </w:pPr>
-      <w:r>
-        <w:rPr>
-          <w:b/>
-        </w:rPr>
+        <w:pStyle w:val="Heading2"/>
+      </w:pPr>
+      <w:r>
         <w:t>4.1 Compare weekday and weekend traffic</w:t>
       </w:r>
     </w:p>
@@ -1349,12 +1270,9 @@
     </w:p>
     <w:p>
       <w:pPr>
-        <w:keepNext/>
-      </w:pPr>
-      <w:r>
-        <w:rPr>
-          <w:b/>
-        </w:rPr>
+        <w:pStyle w:val="Heading2"/>
+      </w:pPr>
+      <w:r>
         <w:t>4.2 Query a specific date and time</w:t>
       </w:r>
     </w:p>
@@ -1417,12 +1335,9 @@
     </w:p>
     <w:p>
       <w:pPr>
-        <w:keepNext/>
-      </w:pPr>
-      <w:r>
-        <w:rPr>
-          <w:b/>
-        </w:rPr>
+        <w:pStyle w:val="Heading2"/>
+      </w:pPr>
+      <w:r>
         <w:lastRenderedPageBreak/>
         <w:t>4.3 Find traffic above a chosen threshold</w:t>
       </w:r>
@@ -1486,12 +1401,9 @@
     </w:p>
     <w:p>
       <w:pPr>
-        <w:keepNext/>
-      </w:pPr>
-      <w:r>
-        <w:rPr>
-          <w:b/>
-        </w:rPr>
+        <w:pStyle w:val="Heading2"/>
+      </w:pPr>
+      <w:r>
         <w:lastRenderedPageBreak/>
         <w:t>4.3 High-traffic results continued</w:t>
       </w:r>
@@ -1545,12 +1457,9 @@
     </w:p>
     <w:p>
       <w:pPr>
-        <w:keepNext/>
-      </w:pPr>
-      <w:r>
-        <w:rPr>
-          <w:b/>
-        </w:rPr>
+        <w:pStyle w:val="Heading2"/>
+      </w:pPr>
+      <w:r>
         <w:lastRenderedPageBreak/>
         <w:t>4.4 Handle an invalid date</w:t>
       </w:r>
@@ -1604,18 +1513,10 @@
     </w:p>
     <w:p>
       <w:r>
-        <w:t xml:space="preserve">The application showed a clear ERROR </w:t>
-      </w:r>
-      <w:proofErr w:type="gramStart"/>
-      <w:r>
-        <w:t xml:space="preserve">explaining </w:t>
-      </w:r>
-      <w:r>
-        <w:t xml:space="preserve"> how</w:t>
-      </w:r>
-      <w:proofErr w:type="gramEnd"/>
-      <w:r>
-        <w:t xml:space="preserve"> </w:t>
+        <w:t xml:space="preserve">The application showed a clear ERROR explaining </w:t>
+      </w:r>
+      <w:r>
+        <w:t xml:space="preserve"> how </w:t>
       </w:r>
       <w:r>
         <w:t xml:space="preserve">the date and time </w:t>
@@ -1676,12 +1577,9 @@
     </w:p>
     <w:p>
       <w:pPr>
-        <w:keepNext/>
-      </w:pPr>
-      <w:r>
-        <w:rPr>
-          <w:b/>
-        </w:rPr>
+        <w:pStyle w:val="Heading2"/>
+      </w:pPr>
+      <w:r>
         <w:t>4.5 Handle an invalid threshold argument</w:t>
       </w:r>
     </w:p>
@@ -1779,7 +1677,67 @@
         </w:drawing>
       </w:r>
     </w:p>
-    <w:p/>
+    <w:p>
+      <w:pPr>
+        <w:pStyle w:val="Heading1"/>
+        <w:pageBreakBefore/>
+      </w:pPr>
+      <w:r>
+        <w:t>Task 5 GitHub and Reproducibility</w:t>
+      </w:r>
+    </w:p>
+    <w:p>
+      <w:pPr>
+        <w:pStyle w:val="Heading2"/>
+      </w:pPr>
+      <w:r>
+        <w:t>5.1 Incremental version control</w:t>
+      </w:r>
+    </w:p>
+    <w:p>
+      <w:r>
+        <w:t>The work was saved in separate, descriptive Git commits. The recorded task commits were 548c9ec for pipeline construction, b7942c4 for feature engineering, c09dc97 for visualisations, bc53926 for the mini traffic analytics application and dafe1bd for GitHub and reproducibility. These changes were pushed to the project repository. A later commit, e39f05c, corrected the README commands and Markdown formatting.</w:t>
+      </w:r>
+    </w:p>
+    <w:p>
+      <w:pPr>
+        <w:pStyle w:val="Heading2"/>
+      </w:pPr>
+      <w:r>
+        <w:t>5.2 Project documentation and run instructions</w:t>
+      </w:r>
+    </w:p>
+    <w:p>
+      <w:r>
+        <w:t>The capstone_part2/README.md documents the project structure, required Python packages, raw data location and script order. From the Part 2 folder, the workflow runs pipeline.py, feature_engineering.py and visualizations.py. The README also gives examples for the query, high-traffic and compare-days application commands, along with invalid-input handling and exit codes.</w:t>
+      </w:r>
+    </w:p>
+    <w:p>
+      <w:pPr>
+        <w:pStyle w:val="Heading2"/>
+      </w:pPr>
+      <w:r>
+        <w:t>5.3 Logging and reproducibility evidence</w:t>
+      </w:r>
+    </w:p>
+    <w:p>
+      <w:r>
+        <w:t>The README explains logging to the console and pipeline.log using a timestamp, log level, module name and message. INFO records normal milestones, WARNING records recoverable data issues, ERROR records failures and DEBUG records internal calculations when debug mode is enabled. Each module uses logging.getLogger(__name__). The sample pipeline.log, saved data and charts, script execution screenshots and command checks in Tasks 1 to 4 provide supporting evidence.</w:t>
+      </w:r>
+    </w:p>
+    <w:p>
+      <w:pPr>
+        <w:pStyle w:val="Heading2"/>
+      </w:pPr>
+      <w:r>
+        <w:t>5.4 Repository location</w:t>
+      </w:r>
+    </w:p>
+    <w:p>
+      <w:r>
+        <w:t>The project repository is https://github.com/sskomal91/smart-city-traffic-capstone. Part 2 files are under capstone_part2. Keep the Part 1 raw dataset with the repository because the pipeline reads part1_data_analytics/Metro_Interstate_Traffic_Volume.csv. Rerunning the processing scripts replaces the generated data and charts.</w:t>
+      </w:r>
+    </w:p>
     <w:sectPr>
       <w:pgSz w:w="11906" w:h="16838"/>
       <w:pgMar w:top="1440" w:right="1440" w:bottom="1440" w:left="1440" w:header="708" w:footer="708" w:gutter="0"/>
@@ -5358,6 +5316,14 @@
   <w:style w:type="paragraph" w:default="1" w:styleId="Normal">
     <w:name w:val="Normal"/>
     <w:qFormat/>
+    <w:pPr>
+      <w:spacing w:after="120"/>
+    </w:pPr>
+    <w:rPr>
+      <w:rFonts w:ascii="Calibri" w:hAnsi="Calibri"/>
+      <w:color w:val="000000"/>
+      <w:sz w:val="22"/>
+    </w:rPr>
   </w:style>
   <w:style w:type="paragraph" w:styleId="Heading1">
     <w:name w:val="heading 1"/>
@@ -5370,13 +5336,12 @@
     <w:pPr>
       <w:keepNext/>
       <w:keepLines/>
-      <w:spacing w:before="360" w:after="80"/>
+      <w:spacing w:before="360"/>
       <w:outlineLvl w:val="0"/>
     </w:pPr>
     <w:rPr>
       <w:rFonts w:asciiTheme="majorHAnsi" w:eastAsiaTheme="majorEastAsia" w:hAnsiTheme="majorHAnsi" w:cstheme="majorBidi"/>
-      <w:color w:val="2F5496" w:themeColor="accent1" w:themeShade="BF"/>
-      <w:sz w:val="40"/>
+      <w:sz w:val="32"/>
       <w:szCs w:val="40"/>
     </w:rPr>
   </w:style>
@@ -5393,13 +5358,12 @@
     <w:pPr>
       <w:keepNext/>
       <w:keepLines/>
-      <w:spacing w:before="160" w:after="80"/>
+      <w:spacing w:before="160"/>
       <w:outlineLvl w:val="1"/>
     </w:pPr>
     <w:rPr>
       <w:rFonts w:asciiTheme="majorHAnsi" w:eastAsiaTheme="majorEastAsia" w:hAnsiTheme="majorHAnsi" w:cstheme="majorBidi"/>
-      <w:color w:val="2F5496" w:themeColor="accent1" w:themeShade="BF"/>
-      <w:sz w:val="32"/>
+      <w:sz w:val="26"/>
       <w:szCs w:val="32"/>
     </w:rPr>
   </w:style>

</xml_diff>